<commit_message>
Everything this week 11/05
</commit_message>
<xml_diff>
--- a/AttitudePointing/EarthTargetPointingFeasibility_OG3.docx
+++ b/AttitudePointing/EarthTargetPointingFeasibility_OG3.docx
@@ -39,7 +39,16 @@
         <w:spacing w:after="120"/>
       </w:pPr>
       <w:r>
-        <w:t>During the far-range rendezvous the spacecraft cycles through two operational attitude modes. Combined Earth and target pointing — Earth for orbit determination and target for inspection and rendezvous — is required every 6 hours per ConOps, with a 25-minute window each time.</w:t>
+        <w:t xml:space="preserve">During the far-range rendezvous the spacecraft cycles through two operational attitude modes. Combined Earth and target pointing — Earth for orbit determination and target for inspection and rendezvous — is required every 6 hours per ConOps, with a </w:t>
+      </w:r>
+      <w:r>
+        <w:rPr>
+          <w:highlight w:val="yellow"/>
+        </w:rPr>
+        <w:t>15-minute window each time</w:t>
+      </w:r>
+      <w:r>
+        <w:t>.</w:t>
       </w:r>
     </w:p>
     <w:p>
@@ -1510,7 +1519,22 @@
         <w:spacing w:after="120"/>
       </w:pPr>
       <w:r>
-        <w:t>The maximum inter-crossing gap of 14.9 hours is more than twice the 6-hour ConOps window interval. This means that in the worst case, two full 6-hour cycles — 12 hours — pass without any X-band feasibility opportunity. Furthermore, not a single 6-hour window boundary falls within 25 minutes of a 90° crossing, confirming that fixed-cadence scheduling cannot guarantee X-band link availability at close range.</w:t>
+        <w:t xml:space="preserve">The maximum inter-crossing gap of 14.9 hours is more than twice the 6-hour ConOps window interval. This means that in the worst case, two full 6-hour cycles — 12 hours — pass without any X-band feasibility opportunity. Furthermore, not a single 6-hour window boundary falls within </w:t>
+      </w:r>
+      <w:r>
+        <w:rPr>
+          <w:highlight w:val="yellow"/>
+        </w:rPr>
+        <w:t>15 minutes of a 90° crossing</w:t>
+      </w:r>
+      <w:r>
+        <w:t xml:space="preserve">, confirming that fixed-cadence scheduling cannot guarantee X-band link availability at close range. </w:t>
+      </w:r>
+      <w:r>
+        <w:rPr>
+          <w:highlight w:val="yellow"/>
+        </w:rPr>
+        <w:t>However, 25 out of 32 windows (78%) contain at least 15 minutes of feasible geometry (|ang − 90°| ≤ 4.5°) within the 6-hour interval, indicating that adaptive scheduling within the window can achieve contact in most cases.</w:t>
       </w:r>
     </w:p>
     <w:p>
@@ -1518,7 +1542,16 @@
         <w:spacing w:after="120"/>
       </w:pPr>
       <w:r>
-        <w:t>The practical implication is significant: X-band combined Earth+Target pointing in the close-range phase cannot be scheduled on a rigid 6-hour grid. Instead, ground contact opportunities must be identified dynamically from the predicted angular separation timeline, and the 25-minute observation slot must be aligned to a crossing event. This requires either an adaptive ConOps with variable-epoch windows, or acceptance of elevated pointing loss (and reduced link margin) during fixed-schedule contacts.</w:t>
+        <w:t xml:space="preserve">The practical implication is significant: X-band combined Earth+Target pointing in the close-range phase cannot be scheduled on a rigid 6-hour grid. Instead, ground contact opportunities must be identified dynamically from the predicted angular separation timeline, and the </w:t>
+      </w:r>
+      <w:r>
+        <w:rPr>
+          <w:highlight w:val="yellow"/>
+        </w:rPr>
+        <w:t>15-minute observation slot</w:t>
+      </w:r>
+      <w:r>
+        <w:t xml:space="preserve"> must be aligned to a crossing event. This requires either an adaptive ConOps with variable-epoch windows, or acceptance of elevated pointing loss (and reduced link margin) during fixed-schedule contacts.</w:t>
       </w:r>
     </w:p>
     <w:p>
@@ -1553,7 +1586,16 @@
         <w:spacing w:after="120"/>
       </w:pPr>
       <w:r>
-        <w:t>Combined Earth+Target pointing is entered from either Mode 1 (Target+Sun) or Mode 2 (Nadir+Sun). The eigenaxis slew angle — the minimum-path rotation required to transition into the combined attitude — determines how much of the 25-minute window is consumed by the attitude manoeuvre. The combined attitude is defined with +Z → target (exact) and +Y → Earth direction projected onto the plane orthogonal to +Z.</w:t>
+        <w:t xml:space="preserve">Combined Earth+Target pointing is entered from either Mode 1 (Target+Sun) or Mode 2 (Nadir+Sun). The eigenaxis slew angle — the minimum-path rotation required to transition into the combined attitude — determines how much of the </w:t>
+      </w:r>
+      <w:r>
+        <w:rPr>
+          <w:highlight w:val="yellow"/>
+        </w:rPr>
+        <w:t>15-minute window is consumed</w:t>
+      </w:r>
+      <w:r>
+        <w:t xml:space="preserve"> by the attitude manoeuvre. The combined attitude is defined with +Z → target (exact) and +Y → Earth direction projected onto the plane orthogonal to +Z.</w:t>
       </w:r>
     </w:p>
     <w:tbl>
@@ -1810,7 +1852,25 @@
         <w:spacing w:after="120"/>
       </w:pPr>
       <w:r>
-        <w:t>ConOps implication: if the spacecraft is in Mode 1 immediately before a combined-pointing window, the transition into and out of the combined attitude consumes less of the 25-minute budget. If transitioning from Mode 2, the manoeuvre budget allocation in the ConOps (typically 5 min in + 15 min link + 5 min out) may be insufficient for a subset of windows, particularly during close-range phases where the slew can approach 180°.</w:t>
+        <w:t xml:space="preserve">ConOps implication: if the spacecraft is in Mode 1 immediately before a combined-pointing window, the transition into and out of the combined attitude consumes less of the </w:t>
+      </w:r>
+      <w:r>
+        <w:rPr>
+          <w:highlight w:val="yellow"/>
+        </w:rPr>
+        <w:t>15-minute budget</w:t>
+      </w:r>
+      <w:r>
+        <w:t xml:space="preserve">. If transitioning from Mode 2, the manoeuvre budget allocation in the ConOps (typically </w:t>
+      </w:r>
+      <w:r>
+        <w:rPr>
+          <w:highlight w:val="yellow"/>
+        </w:rPr>
+        <w:t>3 min in + 9 min link + 3 min out</w:t>
+      </w:r>
+      <w:r>
+        <w:t>) may be insufficient for a subset of windows, particularly during close-range phases where the slew can approach 180°.</w:t>
       </w:r>
     </w:p>
     <w:p>
@@ -2321,7 +2381,25 @@
         <w:spacing w:after="60"/>
       </w:pPr>
       <w:r>
-        <w:t>2. Close-range phase (15.2–23.2 d): feasibility drops sharply to 15.5% within the X-band cone. The separation oscillates over 5.9°–177.2°, and the maximum gap between 90° crossings is 14.9 h. Fixed 6-hour-cadence scheduling achieves 0% probability of a crossing within the 25-minute slot. Combined X-band pointing at close range requires adaptive, crossing-aligned window scheduling.</w:t>
+        <w:t xml:space="preserve">2. Close-range phase (15.2–23.2 d): feasibility drops sharply to 15.5% within the X-band cone. The separation oscillates over 5.9°–177.2°, and the maximum gap between 90° crossings is 14.9 h. Fixed 6-hour-cadence scheduling achieves 0% probability of a crossing within the </w:t>
+      </w:r>
+      <w:r>
+        <w:rPr>
+          <w:highlight w:val="yellow"/>
+        </w:rPr>
+        <w:t>15-minute slot</w:t>
+      </w:r>
+      <w:r>
+        <w:t xml:space="preserve">; </w:t>
+      </w:r>
+      <w:r>
+        <w:rPr>
+          <w:highlight w:val="yellow"/>
+        </w:rPr>
+        <w:t xml:space="preserve">however, 78% of 6-hour windows contain ≥15 min of feasible geometry within the interval, so adaptive scheduling within each window can achieve contact for the majority of passes. </w:t>
+      </w:r>
+      <w:r>
+        <w:t>Combined X-band pointing at close range requires adaptive, crossing-aligned window scheduling.</w:t>
       </w:r>
     </w:p>
     <w:p>

</xml_diff>